<commit_message>
Release 1.20.1 — fix Word "unreadable content" error, SE Agreement Bond layout
- Removed a malformed relationship (wrongly typed as customXml, pointing at
  docProps/meta.xml) from 5 templates — Word flagged these as corrupt and
  offered to "recover" them on open, even though our own preview/PDF
  pipeline tolerated it fine
- SE Agreement Bond: matched the office's own hand-corrected layout — more
  clearance above "AGREEMENT", no gap before Name of Work, and the body
  paragraphs flush left instead of indented

Co-Authored-By: Claude Sonnet 5 <noreply@anthropic.com>
</commit_message>
<xml_diff>
--- a/resources/se-agreement-bond-template.docx
+++ b/resources/se-agreement-bond-template.docx
@@ -14,6 +14,111 @@
           <w:b/>
           <w:u w:val="words"/>
         </w:rPr>
+        <w:t xml:space="preserve"/>
+      </w:r>
+    </w:p>
+    <w:p>
+      <w:pPr>
+        <w:jc w:val="center"/>
+      </w:pPr>
+      <w:r>
+        <w:rPr>
+          <w:rFonts w:ascii="Tahoma" w:hAnsi="Tahoma" w:cs="Tahoma"/>
+          <w:sz w:val="20"/>
+          <w:sz-cs w:val="20"/>
+          <w:b/>
+          <w:u w:val="words"/>
+        </w:rPr>
+        <w:t xml:space="preserve"/>
+      </w:r>
+    </w:p>
+    <w:p>
+      <w:pPr>
+        <w:jc w:val="center"/>
+      </w:pPr>
+      <w:r>
+        <w:rPr>
+          <w:rFonts w:ascii="Tahoma" w:hAnsi="Tahoma" w:cs="Tahoma"/>
+          <w:sz w:val="20"/>
+          <w:sz-cs w:val="20"/>
+          <w:b/>
+          <w:u w:val="words"/>
+        </w:rPr>
+        <w:t xml:space="preserve"/>
+      </w:r>
+    </w:p>
+    <w:p>
+      <w:pPr>
+        <w:jc w:val="center"/>
+      </w:pPr>
+      <w:r>
+        <w:rPr>
+          <w:rFonts w:ascii="Tahoma" w:hAnsi="Tahoma" w:cs="Tahoma"/>
+          <w:sz w:val="20"/>
+          <w:sz-cs w:val="20"/>
+          <w:b/>
+          <w:u w:val="words"/>
+        </w:rPr>
+        <w:t xml:space="preserve"/>
+      </w:r>
+    </w:p>
+    <w:p>
+      <w:pPr>
+        <w:jc w:val="center"/>
+      </w:pPr>
+      <w:r>
+        <w:rPr>
+          <w:rFonts w:ascii="Tahoma" w:hAnsi="Tahoma" w:cs="Tahoma"/>
+          <w:sz w:val="20"/>
+          <w:sz-cs w:val="20"/>
+          <w:b/>
+          <w:u w:val="words"/>
+        </w:rPr>
+        <w:t xml:space="preserve"/>
+      </w:r>
+    </w:p>
+    <w:p>
+      <w:pPr>
+        <w:jc w:val="center"/>
+      </w:pPr>
+      <w:r>
+        <w:rPr>
+          <w:rFonts w:ascii="Tahoma" w:hAnsi="Tahoma" w:cs="Tahoma"/>
+          <w:sz w:val="20"/>
+          <w:sz-cs w:val="20"/>
+          <w:b/>
+          <w:u w:val="words"/>
+        </w:rPr>
+        <w:t xml:space="preserve"/>
+      </w:r>
+    </w:p>
+    <w:p>
+      <w:pPr>
+        <w:jc w:val="center"/>
+      </w:pPr>
+      <w:r>
+        <w:rPr>
+          <w:rFonts w:ascii="Tahoma" w:hAnsi="Tahoma" w:cs="Tahoma"/>
+          <w:sz w:val="20"/>
+          <w:sz-cs w:val="20"/>
+          <w:b/>
+          <w:u w:val="words"/>
+        </w:rPr>
+        <w:t xml:space="preserve"/>
+      </w:r>
+    </w:p>
+    <w:p>
+      <w:pPr>
+        <w:jc w:val="center"/>
+      </w:pPr>
+      <w:r>
+        <w:rPr>
+          <w:rFonts w:ascii="Tahoma" w:hAnsi="Tahoma" w:cs="Tahoma"/>
+          <w:sz w:val="20"/>
+          <w:sz-cs w:val="20"/>
+          <w:b/>
+          <w:u w:val="words"/>
+        </w:rPr>
         <w:t xml:space="preserve">A G R E E M E N T</w:t>
       </w:r>
     </w:p>
@@ -53,20 +158,6 @@
     </w:p>
     <w:p>
       <w:pPr>
-        <w:jc w:val="center"/>
-      </w:pPr>
-      <w:r>
-        <w:rPr>
-          <w:rFonts w:ascii="Tahoma" w:hAnsi="Tahoma" w:cs="Tahoma"/>
-          <w:sz w:val="22"/>
-          <w:sz-cs w:val="22"/>
-          <w:b/>
-        </w:rPr>
-        <w:t xml:space="preserve"/>
-      </w:r>
-    </w:p>
-    <w:p>
-      <w:pPr>
         <w:jc w:val="both"/>
       </w:pPr>
       <w:r>
@@ -182,7 +273,6 @@
     <w:p>
       <w:pPr>
         <w:jc w:val="both"/>
-        <w:ind w:first-line="720"/>
       </w:pPr>
       <w:r>
         <w:rPr>
@@ -213,21 +303,19 @@
     <w:p>
       <w:pPr>
         <w:jc w:val="both"/>
-        <w:ind w:first-line="720"/>
-      </w:pPr>
-      <w:r>
-        <w:rPr>
-          <w:rFonts w:ascii="Times" w:hAnsi="Times" w:cs="Times"/>
-          <w:sz w:val="22"/>
-          <w:sz-cs w:val="22"/>
-        </w:rPr>
-        <w:t xml:space="preserve"/>
-      </w:r>
-    </w:p>
-    <w:p>
-      <w:pPr>
-        <w:jc w:val="both"/>
-        <w:ind w:first-line="720"/>
+      </w:pPr>
+      <w:r>
+        <w:rPr>
+          <w:rFonts w:ascii="Times" w:hAnsi="Times" w:cs="Times"/>
+          <w:sz w:val="22"/>
+          <w:sz-cs w:val="22"/>
+        </w:rPr>
+        <w:t xml:space="preserve"/>
+      </w:r>
+    </w:p>
+    <w:p>
+      <w:pPr>
+        <w:jc w:val="both"/>
       </w:pPr>
       <w:r>
         <w:rPr>
@@ -241,20 +329,6 @@
     <w:p>
       <w:pPr>
         <w:jc w:val="both"/>
-      </w:pPr>
-      <w:r>
-        <w:rPr>
-          <w:rFonts w:ascii="Times" w:hAnsi="Times" w:cs="Times"/>
-          <w:sz w:val="22"/>
-          <w:sz-cs w:val="22"/>
-        </w:rPr>
-        <w:t xml:space="preserve"/>
-      </w:r>
-    </w:p>
-    <w:p>
-      <w:pPr>
-        <w:jc w:val="both"/>
-        <w:ind w:first-line="720"/>
       </w:pPr>
       <w:r>
         <w:rPr>

</xml_diff>